<commit_message>
Auto commit (2026-10-07 18:23) — 7 changes
Claude Code 세션 종료 시 자동 커밋.

Co-Authored-By: Claude <noreply@anthropic.com>
Claude-Session: https://claude.ai/code/07341ff7-2d11-47e5-aca5-0d3259e5d1cd
</commit_message>
<xml_diff>
--- a/projects/40_silver_angel/Vigloo AI Drama Proposal_THE BLACK-HAIRED LOVE HE THREW AWAY_KR_CN.docx
+++ b/projects/40_silver_angel/Vigloo AI Drama Proposal_THE BLACK-HAIRED LOVE HE THREW AWAY_KR_CN.docx
@@ -3139,7 +3139,7 @@
                 <w:rFonts w:ascii="Malgun Gothic" w:hAnsi="Malgun Gothic" w:eastAsia="Malgun Gothic"/>
                 <w:sz w:val="20"/>
               </w:rPr>
-              <w:t>1. 판타지 작품은 연출 차이도 있겠지만 유독 어두컴컴하게 나오는 경우가 많습니다. 집필 쪽에서 제작팀의 연출을 존중해 주시는 것도 중요하지만, 되도록이면 대본에서부터 밝고 화려하게, 우중충한 남성향 느낌이 나지 않게 써 주시면 좋겠습니다. 그러면서도 올리비아가 당하는 굴욕은 시청자가 제대로 맛보게 해 주세요.</w:t>
+              <w:t>1. 판타지 작품은 연출 차이도 있겠지만 유독 어두컴컴하게 나오는 경우가 많습니다. 집필 쪽에서 제작팀의 연출을 존중해 주시는 것도 중요하지만, 되도록이면 대본에서부터 색감은 화사하게, 화면은 밝게, 공간은 판타지답게 채워 주셔서 우중충한 남성향 느낌이 나지 않았으면 합니다. 장소를 정하실 때부터 이 점을 신경 써 주세요. 이야기의 분위기까지 밝고 즐겁게 가자는 뜻은 아닙니다. 올리비아가 당하는 굴욕은 시청자가 제대로 맛보게 해 주세요.</w:t>
             </w:r>
           </w:p>
           <w:p>
@@ -3165,7 +3165,7 @@
                 <w:rFonts w:ascii="Malgun Gothic" w:hAnsi="Malgun Gothic" w:eastAsia="Malgun Gothic"/>
                 <w:sz w:val="20"/>
               </w:rPr>
-              <w:t>1. 奇幻题材虽然也要看导演的处理，但成片往往格外昏暗。编剧这边尊重制作团队的拍摄处理固然重要，但还是希望您尽量从剧本阶段就写得明亮、华丽一些，别带出阴沉的男频味道。同时，也请让观众真真切切地感受到奥利维亚所受的屈辱。</w:t>
+              <w:t>1. 奇幻题材虽然也要看导演的处理，但成片往往格外昏暗。编剧这边尊重制作团队的拍摄处理固然重要，但还是希望您尽量从剧本阶段就把色彩写得鲜亮、画面写得明亮、场景写出奇幻感，别带出阴沉的男频味道。设定场景时就请留意这一点。这里说的明亮，指的是画面和场景，并不是要把故事基调写得轻松欢快。奥利维亚所受的屈辱，还是要让观众真真切切地感受到。</w:t>
             </w:r>
           </w:p>
           <w:p>

</xml_diff>